<commit_message>
docs: add branch operations guide
</commit_message>
<xml_diff>
--- a/artifacts/SAT-J_Ent_Branch_Operations_Guide.docx
+++ b/artifacts/SAT-J_Ent_Branch_Operations_Guide.docx
@@ -70,6 +70,7 @@
       <w:tr>
         <w:trPr>
           <w:tblHeader w:val="true"/>
+          <w:cantSplit/>
         </w:trPr>
         <w:tc>
           <w:tcPr>
@@ -123,6 +124,9 @@
         </w:tc>
       </w:tr>
       <w:tr>
+        <w:trPr>
+          <w:cantSplit/>
+        </w:trPr>
         <w:tc>
           <w:tcPr>
             <w:tcW w:type="dxa" w:w="2376"/>
@@ -165,6 +169,9 @@
         </w:tc>
       </w:tr>
       <w:tr>
+        <w:trPr>
+          <w:cantSplit/>
+        </w:trPr>
         <w:tc>
           <w:tcPr>
             <w:tcW w:type="dxa" w:w="2376"/>
@@ -209,6 +216,9 @@
         </w:tc>
       </w:tr>
       <w:tr>
+        <w:trPr>
+          <w:cantSplit/>
+        </w:trPr>
         <w:tc>
           <w:tcPr>
             <w:tcW w:type="dxa" w:w="2376"/>
@@ -251,6 +261,9 @@
         </w:tc>
       </w:tr>
       <w:tr>
+        <w:trPr>
+          <w:cantSplit/>
+        </w:trPr>
         <w:tc>
           <w:tcPr>
             <w:tcW w:type="dxa" w:w="2376"/>
@@ -295,6 +308,9 @@
         </w:tc>
       </w:tr>
       <w:tr>
+        <w:trPr>
+          <w:cantSplit/>
+        </w:trPr>
         <w:tc>
           <w:tcPr>
             <w:tcW w:type="dxa" w:w="2376"/>
@@ -441,6 +457,7 @@
       <w:tr>
         <w:trPr>
           <w:tblHeader w:val="true"/>
+          <w:cantSplit/>
         </w:trPr>
         <w:tc>
           <w:tcPr>
@@ -519,6 +536,9 @@
         </w:tc>
       </w:tr>
       <w:tr>
+        <w:trPr>
+          <w:cantSplit/>
+        </w:trPr>
         <w:tc>
           <w:tcPr>
             <w:tcW w:type="dxa" w:w="2088"/>
@@ -581,6 +601,9 @@
         </w:tc>
       </w:tr>
       <w:tr>
+        <w:trPr>
+          <w:cantSplit/>
+        </w:trPr>
         <w:tc>
           <w:tcPr>
             <w:tcW w:type="dxa" w:w="2088"/>
@@ -646,6 +669,9 @@
         </w:tc>
       </w:tr>
       <w:tr>
+        <w:trPr>
+          <w:cantSplit/>
+        </w:trPr>
         <w:tc>
           <w:tcPr>
             <w:tcW w:type="dxa" w:w="2088"/>
@@ -708,6 +734,9 @@
         </w:tc>
       </w:tr>
       <w:tr>
+        <w:trPr>
+          <w:cantSplit/>
+        </w:trPr>
         <w:tc>
           <w:tcPr>
             <w:tcW w:type="dxa" w:w="2088"/>
@@ -773,6 +802,9 @@
         </w:tc>
       </w:tr>
       <w:tr>
+        <w:trPr>
+          <w:cantSplit/>
+        </w:trPr>
         <w:tc>
           <w:tcPr>
             <w:tcW w:type="dxa" w:w="2088"/>
@@ -929,6 +961,11 @@
     <w:p>
       <w:r>
         <w:t>The Branch Manager cannot manage system roles, company branches, or employee access unless a separate company-level account grants those permissions.</w:t>
+      </w:r>
+    </w:p>
+    <w:p>
+      <w:r>
+        <w:br w:type="page"/>
       </w:r>
     </w:p>
     <w:p>
@@ -1118,6 +1155,7 @@
       <w:tr>
         <w:trPr>
           <w:tblHeader w:val="true"/>
+          <w:cantSplit/>
         </w:trPr>
         <w:tc>
           <w:tcPr>
@@ -1196,6 +1234,9 @@
         </w:tc>
       </w:tr>
       <w:tr>
+        <w:trPr>
+          <w:cantSplit/>
+        </w:trPr>
         <w:tc>
           <w:tcPr>
             <w:tcW w:type="dxa" w:w="792"/>
@@ -1258,6 +1299,9 @@
         </w:tc>
       </w:tr>
       <w:tr>
+        <w:trPr>
+          <w:cantSplit/>
+        </w:trPr>
         <w:tc>
           <w:tcPr>
             <w:tcW w:type="dxa" w:w="792"/>
@@ -1323,6 +1367,9 @@
         </w:tc>
       </w:tr>
       <w:tr>
+        <w:trPr>
+          <w:cantSplit/>
+        </w:trPr>
         <w:tc>
           <w:tcPr>
             <w:tcW w:type="dxa" w:w="792"/>
@@ -1385,6 +1432,9 @@
         </w:tc>
       </w:tr>
       <w:tr>
+        <w:trPr>
+          <w:cantSplit/>
+        </w:trPr>
         <w:tc>
           <w:tcPr>
             <w:tcW w:type="dxa" w:w="792"/>
@@ -1450,6 +1500,9 @@
         </w:tc>
       </w:tr>
       <w:tr>
+        <w:trPr>
+          <w:cantSplit/>
+        </w:trPr>
         <w:tc>
           <w:tcPr>
             <w:tcW w:type="dxa" w:w="792"/>
@@ -1512,6 +1565,9 @@
         </w:tc>
       </w:tr>
       <w:tr>
+        <w:trPr>
+          <w:cantSplit/>
+        </w:trPr>
         <w:tc>
           <w:tcPr>
             <w:tcW w:type="dxa" w:w="792"/>
@@ -1577,6 +1633,9 @@
         </w:tc>
       </w:tr>
       <w:tr>
+        <w:trPr>
+          <w:cantSplit/>
+        </w:trPr>
         <w:tc>
           <w:tcPr>
             <w:tcW w:type="dxa" w:w="792"/>
@@ -1681,6 +1740,7 @@
       <w:tr>
         <w:trPr>
           <w:tblHeader w:val="true"/>
+          <w:cantSplit/>
         </w:trPr>
         <w:tc>
           <w:tcPr>
@@ -1759,6 +1819,9 @@
         </w:tc>
       </w:tr>
       <w:tr>
+        <w:trPr>
+          <w:cantSplit/>
+        </w:trPr>
         <w:tc>
           <w:tcPr>
             <w:tcW w:type="dxa" w:w="792"/>
@@ -1821,6 +1884,9 @@
         </w:tc>
       </w:tr>
       <w:tr>
+        <w:trPr>
+          <w:cantSplit/>
+        </w:trPr>
         <w:tc>
           <w:tcPr>
             <w:tcW w:type="dxa" w:w="792"/>
@@ -1886,6 +1952,9 @@
         </w:tc>
       </w:tr>
       <w:tr>
+        <w:trPr>
+          <w:cantSplit/>
+        </w:trPr>
         <w:tc>
           <w:tcPr>
             <w:tcW w:type="dxa" w:w="792"/>
@@ -1948,6 +2017,9 @@
         </w:tc>
       </w:tr>
       <w:tr>
+        <w:trPr>
+          <w:cantSplit/>
+        </w:trPr>
         <w:tc>
           <w:tcPr>
             <w:tcW w:type="dxa" w:w="792"/>
@@ -2013,6 +2085,9 @@
         </w:tc>
       </w:tr>
       <w:tr>
+        <w:trPr>
+          <w:cantSplit/>
+        </w:trPr>
         <w:tc>
           <w:tcPr>
             <w:tcW w:type="dxa" w:w="792"/>
@@ -2075,6 +2150,9 @@
         </w:tc>
       </w:tr>
       <w:tr>
+        <w:trPr>
+          <w:cantSplit/>
+        </w:trPr>
         <w:tc>
           <w:tcPr>
             <w:tcW w:type="dxa" w:w="792"/>
@@ -2182,6 +2260,7 @@
       <w:tr>
         <w:trPr>
           <w:tblHeader w:val="true"/>
+          <w:cantSplit/>
         </w:trPr>
         <w:tc>
           <w:tcPr>
@@ -2260,6 +2339,9 @@
         </w:tc>
       </w:tr>
       <w:tr>
+        <w:trPr>
+          <w:cantSplit/>
+        </w:trPr>
         <w:tc>
           <w:tcPr>
             <w:tcW w:type="dxa" w:w="1944"/>
@@ -2322,6 +2404,9 @@
         </w:tc>
       </w:tr>
       <w:tr>
+        <w:trPr>
+          <w:cantSplit/>
+        </w:trPr>
         <w:tc>
           <w:tcPr>
             <w:tcW w:type="dxa" w:w="1944"/>
@@ -2387,6 +2472,9 @@
         </w:tc>
       </w:tr>
       <w:tr>
+        <w:trPr>
+          <w:cantSplit/>
+        </w:trPr>
         <w:tc>
           <w:tcPr>
             <w:tcW w:type="dxa" w:w="1944"/>
@@ -2449,6 +2537,9 @@
         </w:tc>
       </w:tr>
       <w:tr>
+        <w:trPr>
+          <w:cantSplit/>
+        </w:trPr>
         <w:tc>
           <w:tcPr>
             <w:tcW w:type="dxa" w:w="1944"/>
@@ -2514,6 +2605,9 @@
         </w:tc>
       </w:tr>
       <w:tr>
+        <w:trPr>
+          <w:cantSplit/>
+        </w:trPr>
         <w:tc>
           <w:tcPr>
             <w:tcW w:type="dxa" w:w="1944"/>
@@ -2591,6 +2685,9 @@
       </w:r>
     </w:p>
     <w:p>
+      <w:pPr>
+        <w:keepNext/>
+      </w:pPr>
       <w:r>
         <w:t>Transfers move product variants from a source branch to a different active destination branch. The process protects both branch balances and identifies stock that is physically travelling between locations.</w:t>
       </w:r>
@@ -2618,6 +2715,7 @@
       <w:tr>
         <w:trPr>
           <w:tblHeader w:val="true"/>
+          <w:cantSplit/>
         </w:trPr>
         <w:tc>
           <w:tcPr>
@@ -2696,6 +2794,9 @@
         </w:tc>
       </w:tr>
       <w:tr>
+        <w:trPr>
+          <w:cantSplit/>
+        </w:trPr>
         <w:tc>
           <w:tcPr>
             <w:tcW w:type="dxa" w:w="1656"/>
@@ -2758,6 +2859,9 @@
         </w:tc>
       </w:tr>
       <w:tr>
+        <w:trPr>
+          <w:cantSplit/>
+        </w:trPr>
         <w:tc>
           <w:tcPr>
             <w:tcW w:type="dxa" w:w="1656"/>
@@ -2823,6 +2927,9 @@
         </w:tc>
       </w:tr>
       <w:tr>
+        <w:trPr>
+          <w:cantSplit/>
+        </w:trPr>
         <w:tc>
           <w:tcPr>
             <w:tcW w:type="dxa" w:w="1656"/>
@@ -2885,6 +2992,9 @@
         </w:tc>
       </w:tr>
       <w:tr>
+        <w:trPr>
+          <w:cantSplit/>
+        </w:trPr>
         <w:tc>
           <w:tcPr>
             <w:tcW w:type="dxa" w:w="1656"/>
@@ -2950,6 +3060,9 @@
         </w:tc>
       </w:tr>
       <w:tr>
+        <w:trPr>
+          <w:cantSplit/>
+        </w:trPr>
         <w:tc>
           <w:tcPr>
             <w:tcW w:type="dxa" w:w="1656"/>
@@ -3058,6 +3171,7 @@
       <w:tr>
         <w:trPr>
           <w:tblHeader w:val="true"/>
+          <w:cantSplit/>
         </w:trPr>
         <w:tc>
           <w:tcPr>
@@ -3236,6 +3350,9 @@
         </w:tc>
       </w:tr>
       <w:tr>
+        <w:trPr>
+          <w:cantSplit/>
+        </w:trPr>
         <w:tc>
           <w:tcPr>
             <w:tcW w:type="dxa" w:w="1728"/>
@@ -3378,6 +3495,9 @@
         </w:tc>
       </w:tr>
       <w:tr>
+        <w:trPr>
+          <w:cantSplit/>
+        </w:trPr>
         <w:tc>
           <w:tcPr>
             <w:tcW w:type="dxa" w:w="1728"/>
@@ -3527,6 +3647,9 @@
         </w:tc>
       </w:tr>
       <w:tr>
+        <w:trPr>
+          <w:cantSplit/>
+        </w:trPr>
         <w:tc>
           <w:tcPr>
             <w:tcW w:type="dxa" w:w="1728"/>
@@ -3669,6 +3792,9 @@
         </w:tc>
       </w:tr>
       <w:tr>
+        <w:trPr>
+          <w:cantSplit/>
+        </w:trPr>
         <w:tc>
           <w:tcPr>
             <w:tcW w:type="dxa" w:w="1728"/>
@@ -3818,6 +3944,9 @@
         </w:tc>
       </w:tr>
       <w:tr>
+        <w:trPr>
+          <w:cantSplit/>
+        </w:trPr>
         <w:tc>
           <w:tcPr>
             <w:tcW w:type="dxa" w:w="1728"/>
@@ -3996,6 +4125,7 @@
       <w:tr>
         <w:trPr>
           <w:tblHeader w:val="true"/>
+          <w:cantSplit/>
         </w:trPr>
         <w:tc>
           <w:tcPr>
@@ -4049,6 +4179,9 @@
         </w:tc>
       </w:tr>
       <w:tr>
+        <w:trPr>
+          <w:cantSplit/>
+        </w:trPr>
         <w:tc>
           <w:tcPr>
             <w:tcW w:type="dxa" w:w="4608"/>
@@ -4091,6 +4224,9 @@
         </w:tc>
       </w:tr>
       <w:tr>
+        <w:trPr>
+          <w:cantSplit/>
+        </w:trPr>
         <w:tc>
           <w:tcPr>
             <w:tcW w:type="dxa" w:w="4608"/>
@@ -4135,6 +4271,9 @@
         </w:tc>
       </w:tr>
       <w:tr>
+        <w:trPr>
+          <w:cantSplit/>
+        </w:trPr>
         <w:tc>
           <w:tcPr>
             <w:tcW w:type="dxa" w:w="4608"/>
@@ -4177,6 +4316,9 @@
         </w:tc>
       </w:tr>
       <w:tr>
+        <w:trPr>
+          <w:cantSplit/>
+        </w:trPr>
         <w:tc>
           <w:tcPr>
             <w:tcW w:type="dxa" w:w="4608"/>
@@ -4221,6 +4363,9 @@
         </w:tc>
       </w:tr>
       <w:tr>
+        <w:trPr>
+          <w:cantSplit/>
+        </w:trPr>
         <w:tc>
           <w:tcPr>
             <w:tcW w:type="dxa" w:w="4608"/>
@@ -4263,6 +4408,9 @@
         </w:tc>
       </w:tr>
       <w:tr>
+        <w:trPr>
+          <w:cantSplit/>
+        </w:trPr>
         <w:tc>
           <w:tcPr>
             <w:tcW w:type="dxa" w:w="4608"/>
@@ -4354,6 +4502,7 @@
       <w:tr>
         <w:trPr>
           <w:tblHeader w:val="true"/>
+          <w:cantSplit/>
         </w:trPr>
         <w:tc>
           <w:tcPr>
@@ -4432,6 +4581,9 @@
         </w:tc>
       </w:tr>
       <w:tr>
+        <w:trPr>
+          <w:cantSplit/>
+        </w:trPr>
         <w:tc>
           <w:tcPr>
             <w:tcW w:type="dxa" w:w="2016"/>
@@ -4494,6 +4646,9 @@
         </w:tc>
       </w:tr>
       <w:tr>
+        <w:trPr>
+          <w:cantSplit/>
+        </w:trPr>
         <w:tc>
           <w:tcPr>
             <w:tcW w:type="dxa" w:w="2016"/>
@@ -4559,6 +4714,9 @@
         </w:tc>
       </w:tr>
       <w:tr>
+        <w:trPr>
+          <w:cantSplit/>
+        </w:trPr>
         <w:tc>
           <w:tcPr>
             <w:tcW w:type="dxa" w:w="2016"/>
@@ -4621,6 +4779,9 @@
         </w:tc>
       </w:tr>
       <w:tr>
+        <w:trPr>
+          <w:cantSplit/>
+        </w:trPr>
         <w:tc>
           <w:tcPr>
             <w:tcW w:type="dxa" w:w="2016"/>
@@ -4686,6 +4847,9 @@
         </w:tc>
       </w:tr>
       <w:tr>
+        <w:trPr>
+          <w:cantSplit/>
+        </w:trPr>
         <w:tc>
           <w:tcPr>
             <w:tcW w:type="dxa" w:w="2016"/>
@@ -4772,7 +4936,7 @@
         <w:pStyle w:val="ListBullet"/>
       </w:pPr>
       <w:r>
-        <w:t>Combined and branch-level sales, collections, and purchasing results.</w:t>
+        <w:t>Company and branch sales, collections, and purchasing results.</w:t>
       </w:r>
     </w:p>
     <w:p>
@@ -4804,7 +4968,7 @@
         <w:pStyle w:val="ListBullet"/>
       </w:pPr>
       <w:r>
-        <w:t>Employee access records, roles, and audit history where authorised.</w:t>
+        <w:t>Employee access, roles, and audit history where authorised.</w:t>
       </w:r>
     </w:p>
     <w:p>
@@ -4856,6 +5020,7 @@
       <w:tr>
         <w:trPr>
           <w:tblHeader w:val="true"/>
+          <w:cantSplit/>
         </w:trPr>
         <w:tc>
           <w:tcPr>
@@ -4909,6 +5074,9 @@
         </w:tc>
       </w:tr>
       <w:tr>
+        <w:trPr>
+          <w:cantSplit/>
+        </w:trPr>
         <w:tc>
           <w:tcPr>
             <w:tcW w:type="dxa" w:w="2520"/>
@@ -4951,6 +5119,9 @@
         </w:tc>
       </w:tr>
       <w:tr>
+        <w:trPr>
+          <w:cantSplit/>
+        </w:trPr>
         <w:tc>
           <w:tcPr>
             <w:tcW w:type="dxa" w:w="2520"/>
@@ -4995,6 +5166,9 @@
         </w:tc>
       </w:tr>
       <w:tr>
+        <w:trPr>
+          <w:cantSplit/>
+        </w:trPr>
         <w:tc>
           <w:tcPr>
             <w:tcW w:type="dxa" w:w="2520"/>
@@ -5037,6 +5211,9 @@
         </w:tc>
       </w:tr>
       <w:tr>
+        <w:trPr>
+          <w:cantSplit/>
+        </w:trPr>
         <w:tc>
           <w:tcPr>
             <w:tcW w:type="dxa" w:w="2520"/>
@@ -5081,6 +5258,9 @@
         </w:tc>
       </w:tr>
       <w:tr>
+        <w:trPr>
+          <w:cantSplit/>
+        </w:trPr>
         <w:tc>
           <w:tcPr>
             <w:tcW w:type="dxa" w:w="2520"/>
@@ -5123,6 +5303,9 @@
         </w:tc>
       </w:tr>
       <w:tr>
+        <w:trPr>
+          <w:cantSplit/>
+        </w:trPr>
         <w:tc>
           <w:tcPr>
             <w:tcW w:type="dxa" w:w="2520"/>
@@ -5396,7 +5579,7 @@
     <w:sectPr>
       <w:footerReference w:type="default" r:id="rId9"/>
       <w:pgSz w:w="12240" w:h="15840"/>
-      <w:pgMar w:top="1037" w:right="1123" w:bottom="1037" w:left="1123" w:header="720" w:footer="720" w:gutter="0"/>
+      <w:pgMar w:top="1037" w:right="1123" w:bottom="1224" w:left="1123" w:header="720" w:footer="720" w:gutter="0"/>
       <w:cols w:space="720"/>
       <w:docGrid w:linePitch="360"/>
     </w:sectPr>
@@ -6144,9 +6327,6 @@
     <w:rsid w:val="00FC693F"/>
     <w:pPr>
       <w:keepNext/>
-      <w:pBdr>
-        <w:bottom w:val="single" w:sz="8" w:space="4" w:color="4F81BD" w:themeColor="accent1"/>
-      </w:pBdr>
       <w:spacing w:after="240" w:line="240" w:lineRule="auto" w:before="0"/>
       <w:contextualSpacing/>
     </w:pPr>

</xml_diff>